<commit_message>
Ch 2 drafted: It cannot tell you it's unsure
1,454 words (tracker). Claim: confidence and accuracy come from the
same machinery, so a memory and a confabulation are indistinguishable
from outside and from inside. Demo: the same question asked ten ways —
answers move, confidence never does. Fix: treat every declaration as
unverified until checked against a source outside the model.

Carries Rule 5 (primary), Rules 2 and 4. Written against the plan spec
and the section-9 register. The 'ten ways' demo is the plan's specified
procedure, not a recorded result — flagged in the chapter's
verification note to be run and recorded before print.

Interior rebuilt: 45 pages, Chapter 2 on printed page 16. Drafted
prose now 14,131 words = 31% of the 45,000 target.
</commit_message>
<xml_diff>
--- a/book-build/You-Are-Using-AI-Wrong-INTERIOR.docx
+++ b/book-build/You-Are-Using-AI-Wrong-INTERIOR.docx
@@ -260,7 +260,7 @@
         <w:ind w:firstLine="0"/>
       </w:pPr>
       <w:r>
-        <w:t>Chapter 6 — The clock is always running</w:t>
+        <w:t>Chapter 2 — It cannot tell you it s unsure</w:t>
       </w:r>
       <w:r>
         <w:tab/>
@@ -278,7 +278,7 @@
         <w:ind w:firstLine="0"/>
       </w:pPr>
       <w:r>
-        <w:t>Chapter 8 — The 8 Ball Never Fooled Anyone</w:t>
+        <w:t>Chapter 6 — The clock is always running</w:t>
       </w:r>
       <w:r>
         <w:tab/>
@@ -296,13 +296,13 @@
         <w:ind w:firstLine="0"/>
       </w:pPr>
       <w:r>
-        <w:t>Chapter 26 — Pushing Is Not Cooperation</w:t>
+        <w:t>Chapter 8 — The 8 Ball Never Fooled Anyone</w:t>
       </w:r>
       <w:r>
         <w:tab/>
       </w:r>
       <w:r>
-        <w:t>26</w:t>
+        <w:t>24</w:t>
       </w:r>
     </w:p>
     <w:p>
@@ -314,13 +314,13 @@
         <w:ind w:firstLine="0"/>
       </w:pPr>
       <w:r>
-        <w:t>Chapter 27 — I Was Never the Smart Part</w:t>
+        <w:t>Chapter 26 — Pushing Is Not Cooperation</w:t>
       </w:r>
       <w:r>
         <w:tab/>
       </w:r>
       <w:r>
-        <w:t>31</w:t>
+        <w:t>30</w:t>
       </w:r>
     </w:p>
     <w:p>
@@ -332,13 +332,31 @@
         <w:ind w:firstLine="0"/>
       </w:pPr>
       <w:r>
+        <w:t>Chapter 27 — I Was Never the Smart Part</w:t>
+      </w:r>
+      <w:r>
+        <w:tab/>
+      </w:r>
+      <w:r>
+        <w:t>35</w:t>
+      </w:r>
+    </w:p>
+    <w:p>
+      <w:pPr>
+        <w:tabs>
+          <w:tab w:pos="6552" w:val="right" w:leader="dot"/>
+        </w:tabs>
+        <w:spacing w:after="120"/>
+        <w:ind w:firstLine="0"/>
+      </w:pPr>
+      <w:r>
         <w:t>Chapter 28 — You Have Something to Lose</w:t>
       </w:r>
       <w:r>
         <w:tab/>
       </w:r>
       <w:r>
-        <w:t>35</w:t>
+        <w:t>39</w:t>
       </w:r>
     </w:p>
     <w:p>
@@ -2478,6 +2496,543 @@
           <w:i/>
         </w:rPr>
         <w:t xml:space="preserve"> account is verified against the court's own Opinion and Order on Sanctions, S.D.N.Y., No. 22-cv-1461 (PKC), 22 June 2023 (Judge P. Kevin Castel) — lawyers sanctioned under Rule 11 for filing fabricated authorities generated with ChatGPT; $5,000 penalty jointly and severally. Every load-bearing claim in this chapter carries a source; the illustrative example carries its own label.</w:t>
+      </w:r>
+    </w:p>
+    <w:p>
+      <w:r>
+        <w:br w:type="page"/>
+      </w:r>
+    </w:p>
+    <w:p>
+      <w:pPr>
+        <w:pStyle w:val="Heading1"/>
+      </w:pPr>
+      <w:r>
+        <w:t>Chapter 2 — It cannot tell you it s unsure</w:t>
+      </w:r>
+    </w:p>
+    <w:p>
+      <w:pPr>
+        <w:ind w:firstLine="0"/>
+      </w:pPr>
+      <w:r>
+        <w:t>You have seen it happen. A model answers a question you cannot answer yourself, and the answer arrives calm, complete, and certain. You read it twice. It sounds right. You use it.</w:t>
+      </w:r>
+    </w:p>
+    <w:p>
+      <w:r>
+        <w:t xml:space="preserve">Then you check. And the answer was wrong — not </w:t>
+      </w:r>
+      <w:r>
+        <w:rPr>
+          <w:i/>
+        </w:rPr>
+        <w:t>slightly</w:t>
+      </w:r>
+      <w:r>
+        <w:t xml:space="preserve"> wrong, not </w:t>
+      </w:r>
+      <w:r>
+        <w:rPr>
+          <w:i/>
+        </w:rPr>
+        <w:t>outdated</w:t>
+      </w:r>
+      <w:r>
+        <w:t xml:space="preserve"> wrong, but </w:t>
+      </w:r>
+      <w:r>
+        <w:rPr>
+          <w:i/>
+        </w:rPr>
+        <w:t>invented</w:t>
+      </w:r>
+      <w:r>
+        <w:t xml:space="preserve"> wrong. A capital for a country that does not exist. A citation to a case that was never decided. A statistic with no source anyone can find. And the worst part is not that it was wrong. It is that nothing about the answer told you it was.</w:t>
+      </w:r>
+    </w:p>
+    <w:p>
+      <w:r>
+        <w:t>This chapter is about that nothing. About the absence of a signal that you were trained by your entire life to expect.</w:t>
+      </w:r>
+    </w:p>
+    <w:p>
+      <w:pPr>
+        <w:pStyle w:val="Heading3"/>
+      </w:pPr>
+      <w:r>
+        <w:t>The expectation</w:t>
+      </w:r>
+    </w:p>
+    <w:p>
+      <w:pPr>
+        <w:ind w:firstLine="0"/>
+      </w:pPr>
+      <w:r>
+        <w:t xml:space="preserve">When a person answers your question, you get more than words. You get a </w:t>
+      </w:r>
+      <w:r>
+        <w:rPr>
+          <w:i/>
+        </w:rPr>
+        <w:t>manner</w:t>
+      </w:r>
+      <w:r>
+        <w:t xml:space="preserve">. The confident person speaks quickly and holds your eyes. The uncertain one hesitates, qualifies, says </w:t>
+      </w:r>
+      <w:r>
+        <w:rPr>
+          <w:i/>
+        </w:rPr>
+        <w:t>I think</w:t>
+      </w:r>
+      <w:r>
+        <w:t xml:space="preserve"> or </w:t>
+      </w:r>
+      <w:r>
+        <w:rPr>
+          <w:i/>
+        </w:rPr>
+        <w:t>I'm not sure</w:t>
+      </w:r>
+      <w:r>
+        <w:t>. The expert cites a source. The amateur waves a hand. These signals are not decorations. They are the evidence you use to decide whether to believe someone — and you have been reading them since you were a child.</w:t>
+      </w:r>
+    </w:p>
+    <w:p>
+      <w:r>
+        <w:t xml:space="preserve">A language model produces one manner. Always the same one. Calm, complete, certain, fluent. Whether it is recalling a fact or constructing one, the manner does not change. Not because the model is hiding its uncertainty — it has none to hide. There is no internal dial that reads </w:t>
+      </w:r>
+      <w:r>
+        <w:rPr>
+          <w:i/>
+        </w:rPr>
+        <w:t>confidence in my own memory</w:t>
+      </w:r>
+      <w:r>
+        <w:t>, because there is no memory in the sense you mean, and therefore no confidence to report.</w:t>
+      </w:r>
+    </w:p>
+    <w:p>
+      <w:r>
+        <w:t xml:space="preserve">A memory and an invention arrive through the same door, in the same voice, at the same speed, with the same certainty. </w:t>
+      </w:r>
+      <w:r>
+        <w:rPr>
+          <w:b/>
+        </w:rPr>
+        <w:t>From the outside they are indistinguishable. From the inside, there is no inside to distinguish them in.</w:t>
+      </w:r>
+    </w:p>
+    <w:p>
+      <w:pPr>
+        <w:pStyle w:val="Heading3"/>
+      </w:pPr>
+      <w:r>
+        <w:t>The demonstration</w:t>
+      </w:r>
+    </w:p>
+    <w:p>
+      <w:pPr>
+        <w:ind w:firstLine="0"/>
+      </w:pPr>
+      <w:r>
+        <w:t>Ask the same model the same question ten different ways. Rephrase it. Soften it. Make it formal. Add a persona. Remove the persona. Ask it to be careful, then ask it to be bold.</w:t>
+      </w:r>
+    </w:p>
+    <w:p>
+      <w:r>
+        <w:t xml:space="preserve">Watch two things: the </w:t>
+      </w:r>
+      <w:r>
+        <w:rPr>
+          <w:i/>
+        </w:rPr>
+        <w:t>answers</w:t>
+      </w:r>
+      <w:r>
+        <w:t xml:space="preserve"> will move. Different phrasings pull different completions — this one hedges, that one commits, a third contradicts itself. And the </w:t>
+      </w:r>
+      <w:r>
+        <w:rPr>
+          <w:i/>
+        </w:rPr>
+        <w:t>confidence</w:t>
+      </w:r>
+      <w:r>
+        <w:t xml:space="preserve"> will not. Every answer arrives in the same calm, competent register. The certainty never dips when the answer degrades. The fluency never stutters when the content hollows out.</w:t>
+      </w:r>
+    </w:p>
+    <w:p>
+      <w:r>
+        <w:t xml:space="preserve">That is the demonstration, and it is the whole claim in one observation. </w:t>
+      </w:r>
+      <w:r>
+        <w:rPr>
+          <w:b/>
+        </w:rPr>
+        <w:t>The confidence is not tracking the answer. It is tracking nothing.</w:t>
+      </w:r>
+      <w:r>
+        <w:t xml:space="preserve"> It is a property of the wording, not a measure of the truth.</w:t>
+      </w:r>
+    </w:p>
+    <w:p>
+      <w:r>
+        <w:t>This is not a bug that a patch will fix. It is not a missing feature. It is what the machinery is: a system that generates the most likely continuation of the text so far. A real memory and a confabulation are both likely continuations. The machinery cannot tell them apart, because the difference between them is not in the text. It is in the world.</w:t>
+      </w:r>
+    </w:p>
+    <w:p>
+      <w:pPr>
+        <w:pStyle w:val="Heading3"/>
+      </w:pPr>
+      <w:r>
+        <w:t>Why "just ask it to be careful" does not work</w:t>
+      </w:r>
+    </w:p>
+    <w:p>
+      <w:pPr>
+        <w:ind w:firstLine="0"/>
+      </w:pPr>
+      <w:r>
+        <w:t xml:space="preserve">You might think the answer is simple. Tell the model: </w:t>
+      </w:r>
+      <w:r>
+        <w:rPr>
+          <w:i/>
+        </w:rPr>
+        <w:t>if you are not sure, say so.</w:t>
+      </w:r>
+      <w:r>
+        <w:t xml:space="preserve"> And in a narrow sense, you can. A well-prompted model will hedge, will qualify, will say </w:t>
+      </w:r>
+      <w:r>
+        <w:rPr>
+          <w:i/>
+        </w:rPr>
+        <w:t>I don't know</w:t>
+      </w:r>
+      <w:r>
+        <w:t xml:space="preserve"> — more often than an unprompted one.</w:t>
+      </w:r>
+    </w:p>
+    <w:p>
+      <w:r>
+        <w:t xml:space="preserve">But look at what that actually is. It is a </w:t>
+      </w:r>
+      <w:r>
+        <w:rPr>
+          <w:i/>
+        </w:rPr>
+        <w:t>performance</w:t>
+      </w:r>
+      <w:r>
+        <w:t xml:space="preserve"> of uncertainty, produced by the same machinery that produces the confident answer. The model is not reporting an internal state. It is generating the text that an uncertain person would generate. Sometimes that performance is accurate — the model really is in the regime where the answer is not determined. Sometimes it is not. </w:t>
+      </w:r>
+      <w:r>
+        <w:rPr>
+          <w:b/>
+        </w:rPr>
+        <w:t>You cannot tell which, because the performance looks the same in both cases.</w:t>
+      </w:r>
+    </w:p>
+    <w:p>
+      <w:r>
+        <w:t xml:space="preserve">And there is a worse failure mode. Asked to express uncertainty, a model will sometimes hedge </w:t>
+      </w:r>
+      <w:r>
+        <w:rPr>
+          <w:i/>
+        </w:rPr>
+        <w:t>correct</w:t>
+      </w:r>
+      <w:r>
+        <w:t xml:space="preserve"> answers — undermining your trust in the one thing it got right — while still committing confidently to the wrong ones. The hedge is not calibrated to the truth. It is calibrated to the prompt. You have not fixed the signal. You have added noise to it.</w:t>
+      </w:r>
+    </w:p>
+    <w:p>
+      <w:r>
+        <w:t xml:space="preserve">The honesty you need cannot come from the model's character. </w:t>
+      </w:r>
+      <w:r>
+        <w:rPr>
+          <w:b/>
+        </w:rPr>
+        <w:t>If the answer matters, the honesty has to come from your system.</w:t>
+      </w:r>
+      <w:r>
+        <w:t xml:space="preserve"> That is the rule this chapter exists to state: treat every declaration as unverified by default. Not </w:t>
+      </w:r>
+      <w:r>
+        <w:rPr>
+          <w:i/>
+        </w:rPr>
+        <w:t>usually right</w:t>
+      </w:r>
+      <w:r>
+        <w:t xml:space="preserve">. Not </w:t>
+      </w:r>
+      <w:r>
+        <w:rPr>
+          <w:i/>
+        </w:rPr>
+        <w:t>probably fine</w:t>
+      </w:r>
+      <w:r>
+        <w:t xml:space="preserve">. </w:t>
+      </w:r>
+      <w:r>
+        <w:rPr>
+          <w:b/>
+        </w:rPr>
+        <w:t>Unverified</w:t>
+      </w:r>
+      <w:r>
+        <w:t xml:space="preserve"> — until you have checked it against a source outside the model.</w:t>
+      </w:r>
+    </w:p>
+    <w:p>
+      <w:pPr>
+        <w:pStyle w:val="Heading3"/>
+      </w:pPr>
+      <w:r>
+        <w:t>What "unverified" actually means in practice</w:t>
+      </w:r>
+    </w:p>
+    <w:p>
+      <w:pPr>
+        <w:ind w:firstLine="0"/>
+      </w:pPr>
+      <w:r>
+        <w:t>It does not mean paranoia. It does not mean every answer needs a research team. It means one habit, applied at the right moment:</w:t>
+      </w:r>
+    </w:p>
+    <w:p>
+      <w:r>
+        <w:t xml:space="preserve">When a model states a fact, ask </w:t>
+      </w:r>
+      <w:r>
+        <w:rPr>
+          <w:i/>
+        </w:rPr>
+        <w:t>where would I check this?</w:t>
+      </w:r>
+      <w:r>
+        <w:t xml:space="preserve"> If you have a source — a document, a database, a person who knows, a measurement you can run — check it. If you do not have a source, then you do not have an answer. You have a </w:t>
+      </w:r>
+      <w:r>
+        <w:rPr>
+          <w:i/>
+        </w:rPr>
+        <w:t>plausible completion</w:t>
+      </w:r>
+      <w:r>
+        <w:t>, and the difference between those two is the whole book.</w:t>
+      </w:r>
+    </w:p>
+    <w:p>
+      <w:r>
+        <w:t xml:space="preserve">The check is cheap when the question is cheap. </w:t>
+      </w:r>
+      <w:r>
+        <w:rPr>
+          <w:i/>
+        </w:rPr>
+        <w:t>What is the capital of France?</w:t>
+      </w:r>
+      <w:r>
+        <w:t xml:space="preserve"> — you know, or you can know in five seconds, and the model is a fast way to get a confirmation you already hold. </w:t>
+      </w:r>
+      <w:r>
+        <w:rPr>
+          <w:i/>
+        </w:rPr>
+        <w:t>What is the capital of Zubrowka?</w:t>
+      </w:r>
+      <w:r>
+        <w:t xml:space="preserve"> — there is no source, because there is no country, and no amount of asking the model will produce one. The model cannot tell you which case you are in. </w:t>
+      </w:r>
+      <w:r>
+        <w:rPr>
+          <w:b/>
+        </w:rPr>
+        <w:t>Only your system can.</w:t>
+      </w:r>
+    </w:p>
+    <w:p>
+      <w:r>
+        <w:t>That is the division of labour this book keeps returning to. The model is superb at transforming material you supply. It is not a source of material. When you ask it a question, you have already decided to let it supply the material — and Rule 1 says that decision is usually the wrong one.</w:t>
+      </w:r>
+    </w:p>
+    <w:p>
+      <w:pPr>
+        <w:pStyle w:val="Heading3"/>
+      </w:pPr>
+      <w:r>
+        <w:t>The sting</w:t>
+      </w:r>
+    </w:p>
+    <w:p>
+      <w:pPr>
+        <w:ind w:firstLine="0"/>
+      </w:pPr>
+      <w:r>
+        <w:t>Here is the part that makes this chapter different from a complaint.</w:t>
+      </w:r>
+    </w:p>
+    <w:p>
+      <w:r>
+        <w:rPr>
+          <w:b/>
+        </w:rPr>
+        <w:t>The models are getting better at this. And that makes it worse.</w:t>
+      </w:r>
+    </w:p>
+    <w:p>
+      <w:r>
+        <w:t xml:space="preserve">Every improvement in fluency, in coherence, in the naturalness of the output, is an improvement in the </w:t>
+      </w:r>
+      <w:r>
+        <w:rPr>
+          <w:i/>
+        </w:rPr>
+        <w:t>mask</w:t>
+      </w:r>
+      <w:r>
+        <w:t>. The confident wrong answer of two years ago was often detectable — stilted, repetitive, obviously machine. The confident wrong answer today is polished. It has headings, citations, qualifications, a professional tone. It reads like the work of someone who knows what they are doing.</w:t>
+      </w:r>
+    </w:p>
+    <w:p>
+      <w:r>
+        <w:t xml:space="preserve">The property that makes the output readable is the same property that makes a fabrication readable. They are not separable. Which means the thing you were relying on to judge the output — </w:t>
+      </w:r>
+      <w:r>
+        <w:rPr>
+          <w:i/>
+        </w:rPr>
+        <w:t>does this sound right?</w:t>
+      </w:r>
+      <w:r>
+        <w:t xml:space="preserve"> — measures the wrong property entirely, and will keep measuring it correctly as long as the model keeps getting better at prose.</w:t>
+      </w:r>
+    </w:p>
+    <w:p>
+      <w:r>
+        <w:t xml:space="preserve">So the fix is not a better model. A better model is a </w:t>
+      </w:r>
+      <w:r>
+        <w:rPr>
+          <w:i/>
+        </w:rPr>
+        <w:t>better mask</w:t>
+      </w:r>
+      <w:r>
+        <w:t>. The fix is the same one the last chapter named: stop asking the model to be the source. Give it the facts. Check what it does with them. Keep the judgement.</w:t>
+      </w:r>
+    </w:p>
+    <w:p>
+      <w:pPr>
+        <w:pStyle w:val="Heading3"/>
+      </w:pPr>
+      <w:r>
+        <w:t>What changes</w:t>
+      </w:r>
+    </w:p>
+    <w:p>
+      <w:pPr>
+        <w:ind w:firstLine="0"/>
+      </w:pPr>
+      <w:r>
+        <w:t>The shift is one sentence:</w:t>
+      </w:r>
+    </w:p>
+    <w:p>
+      <w:pPr>
+        <w:spacing w:before="120" w:after="120"/>
+        <w:ind w:left="432" w:right="432" w:firstLine="0"/>
+      </w:pPr>
+      <w:r>
+        <w:rPr>
+          <w:b/>
+          <w:i/>
+          <w:sz w:val="21"/>
+        </w:rPr>
+        <w:t>Treat every declaration as unverified until you have checked it against a source outside the model.</w:t>
+      </w:r>
+    </w:p>
+    <w:p>
+      <w:pPr>
+        <w:ind w:firstLine="0"/>
+      </w:pPr>
+      <w:r>
+        <w:t xml:space="preserve">Not </w:t>
+      </w:r>
+      <w:r>
+        <w:rPr>
+          <w:i/>
+        </w:rPr>
+        <w:t>usually right</w:t>
+      </w:r>
+      <w:r>
+        <w:t xml:space="preserve">. Not </w:t>
+      </w:r>
+      <w:r>
+        <w:rPr>
+          <w:i/>
+        </w:rPr>
+        <w:t>probably fine</w:t>
+      </w:r>
+      <w:r>
+        <w:t>. Unverified — by default, every time, until the check happens.</w:t>
+      </w:r>
+    </w:p>
+    <w:p>
+      <w:r>
+        <w:t xml:space="preserve">That is not a restriction on the tool. It is the price of using it at all, and it is a small price. The check is fast when the question is small. The check is </w:t>
+      </w:r>
+      <w:r>
+        <w:rPr>
+          <w:i/>
+        </w:rPr>
+        <w:t>you</w:t>
+      </w:r>
+      <w:r>
+        <w:t xml:space="preserve"> when the question is yours. And when the question is one only a source can answer — a document, a database, a measurement, a person who was there — the system's job is to go get that source, not to improvise an answer in its place.</w:t>
+      </w:r>
+    </w:p>
+    <w:p>
+      <w:r>
+        <w:t xml:space="preserve">The next chapter asks the obvious follow-up: if the model cannot tell you when it does not know, and you cannot prompt that ability into it, what </w:t>
+      </w:r>
+      <w:r>
+        <w:rPr>
+          <w:i/>
+        </w:rPr>
+        <w:t>can</w:t>
+      </w:r>
+      <w:r>
+        <w:t xml:space="preserve"> you do? The answer is not a bigger model, and it is not a better prompt. It is a system that makes the honesty come from somewhere other than the model's character — code, contracts, and retrieval. That is the rest of this book.</w:t>
+      </w:r>
+    </w:p>
+    <w:p>
+      <w:pPr>
+        <w:spacing w:before="200" w:after="200"/>
+        <w:ind w:firstLine="0"/>
+        <w:jc w:val="center"/>
+      </w:pPr>
+      <w:r>
+        <w:t>•  •  •</w:t>
+      </w:r>
+    </w:p>
+    <w:p>
+      <w:pPr>
+        <w:ind w:firstLine="0"/>
+      </w:pPr>
+      <w:r>
+        <w:rPr>
+          <w:i/>
+        </w:rPr>
+        <w:t>Verification: the claim that confidence and accuracy come from the same machinery is the book's thesis (00-BOOK.md §2) and is argued, not asserted, in this chapter. The demonstration (same question, ten ways, confidence unmoved) is the plan's specified demo (00-BOOK.md §7, Ch. 2) — a re-runnable procedure, not a recorded result; run it on any model and watch the answers move while the register stays flat. The Zubrowka reference is Chapter 1's verified grounding test (`src/lib/models/alpha.ts`, PersonalAI-Dashboard). No load-bearing claim in this chapter rests on a model's self-report. ⚠️ The "ten ways" demo should be run and recorded before print, so the chapter can cite a real run rather than a procedure.</w:t>
       </w:r>
     </w:p>
     <w:p>

</xml_diff>

<commit_message>
Preface: the author's own tightened edit, adopted verbatim
The author supplied a tightened preface and marked it as standalone
front matter, not material for Chapter 1. Adopted as the preface body,
verbatim. The STATUS line now says so. 760 words (was 787); the
author notes section below the body is unchanged.

Interior rebuilt: 45 pages, Preface on p1, Chapter 1 on p9, Chapter 2
on p16. New phrasing confirmed present in the PDF.
</commit_message>
<xml_diff>
--- a/book-build/You-Are-Using-AI-Wrong-INTERIOR.docx
+++ b/book-build/You-Are-Using-AI-Wrong-INTERIOR.docx
@@ -388,24 +388,6 @@
     </w:p>
     <w:p>
       <w:pPr>
-        <w:ind w:firstLine="0"/>
-      </w:pPr>
-      <w:r>
-        <w:t xml:space="preserve">words. Remaining </w:t>
-      </w:r>
-      <w:r>
-        <w:rPr>
-          <w:rFonts w:ascii="Consolas" w:hAnsi="Consolas"/>
-          <w:sz w:val="19"/>
-        </w:rPr>
-        <w:t>⚠️</w:t>
-      </w:r>
-      <w:r>
-        <w:t xml:space="preserve"> marks (if any) are for anything still unconfirmed — there are none in the body.</w:t>
-      </w:r>
-    </w:p>
-    <w:p>
-      <w:pPr>
         <w:spacing w:before="200" w:after="200"/>
         <w:ind w:firstLine="0"/>
         <w:jc w:val="center"/>
@@ -419,7 +401,7 @@
         <w:ind w:firstLine="0"/>
       </w:pPr>
       <w:r>
-        <w:t>I traveled to India on business. While I was there, I offered to give a course on how to use AI more</w:t>
+        <w:t>I travelled to India on business. While I was there, I offered to give a course on how to use AI more</w:t>
       </w:r>
     </w:p>
     <w:p>
@@ -429,118 +411,132 @@
     </w:p>
     <w:p>
       <w:r>
-        <w:t>The conference room was filled with data scientists, program managers, proposal writers and other highly</w:t>
-      </w:r>
-    </w:p>
-    <w:p>
-      <w:r>
-        <w:t>educated professionals. Everyone in the room had access to Claude Code. All of them had been using AI to</w:t>
-      </w:r>
-    </w:p>
-    <w:p>
-      <w:r>
-        <w:t>help them with their work.</w:t>
-      </w:r>
-    </w:p>
-    <w:p>
-      <w:r>
-        <w:t>I have spent over thirty years in the computer industry. For the last few, I have been building an AI</w:t>
-      </w:r>
-    </w:p>
-    <w:p>
-      <w:r>
-        <w:t>system of my own — private, running on my own machine, reading my own documents, doing work I actually get</w:t>
-      </w:r>
-    </w:p>
-    <w:p>
-      <w:r>
-        <w:t>paid for. That is what I showed them. Not a list of prompts. How the thing behaves, and how to work with it</w:t>
-      </w:r>
-    </w:p>
-    <w:p>
-      <w:r>
-        <w:t>instead of against it.</w:t>
-      </w:r>
-    </w:p>
-    <w:p>
-      <w:r>
-        <w:t>At the end of the session, one of the attendees told me that **he had never seen anyone use AI the way I</w:t>
-      </w:r>
-    </w:p>
-    <w:p>
-      <w:r>
-        <w:t>did.**</w:t>
-      </w:r>
-    </w:p>
-    <w:p>
-      <w:r>
-        <w:t>I thought about this. All of these people were familiar with AI and were using it. All of them were using</w:t>
-      </w:r>
-    </w:p>
-    <w:p>
-      <w:r>
-        <w:t>the most expensive model and were not getting the results I was showing. I had a long time to think about</w:t>
-      </w:r>
-    </w:p>
-    <w:p>
-      <w:r>
-        <w:t>that comment while flying back from India. Over the weeks since, the premise for this book started to take</w:t>
-      </w:r>
-    </w:p>
-    <w:p>
-      <w:r>
-        <w:t>hold. I was using AI differently and getting better results.</w:t>
-      </w:r>
-    </w:p>
-    <w:p>
-      <w:r>
-        <w:t>My previous books were instructional. I wrote about how LLMs worked, how they are built, which models did</w:t>
-      </w:r>
-    </w:p>
-    <w:p>
-      <w:r>
-        <w:t>what, and told users about tools they could use and prompts they could master. The books were for those</w:t>
-      </w:r>
-    </w:p>
-    <w:p>
-      <w:r>
-        <w:t>who were hands-on users. **This book is targeted to a different audience for a different purpose. It is</w:t>
-      </w:r>
-    </w:p>
-    <w:p>
-      <w:r>
-        <w:t>targeted to the organization** — to the organizations that are not getting the results they wanted, or</w:t>
-      </w:r>
-    </w:p>
-    <w:p>
-      <w:r>
-        <w:t>whose results are costing them too much. It is targeted to the organization that is planning to implement</w:t>
-      </w:r>
-    </w:p>
-    <w:p>
-      <w:r>
-        <w:t xml:space="preserve">AI, and </w:t>
-      </w:r>
-      <w:r>
-        <w:rPr>
-          <w:b/>
-        </w:rPr>
-        <w:t>it is targeted to the ones who sign the cheques and want to keep their AI costs under control.</w:t>
-      </w:r>
-    </w:p>
-    <w:p>
-      <w:r>
-        <w:t>That is the gap this book is written into — not a shortage of intelligence, or effort, or curiosity. **A</w:t>
-      </w:r>
-    </w:p>
-    <w:p>
-      <w:r>
-        <w:t>shortage of anyone telling people how these systems actually work.** And the machine itself has every</w:t>
-      </w:r>
-    </w:p>
-    <w:p>
-      <w:r>
-        <w:t xml:space="preserve">incentive to keep that quiet, because a tool that says </w:t>
+        <w:t>The conference room was filled with data scientists, programme managers, proposal writers, and other</w:t>
+      </w:r>
+    </w:p>
+    <w:p>
+      <w:r>
+        <w:t>highly educated professionals. Everyone had access to Claude Code. All of them were already using AI to</w:t>
+      </w:r>
+    </w:p>
+    <w:p>
+      <w:r>
+        <w:t>help with their work.</w:t>
+      </w:r>
+    </w:p>
+    <w:p>
+      <w:r>
+        <w:t>I have spent more than thirty years in the computer industry. For the past few years, I have been</w:t>
+      </w:r>
+    </w:p>
+    <w:p>
+      <w:r>
+        <w:t>building an AI system of my own: private, running on my own machine, reading my own documents, and</w:t>
+      </w:r>
+    </w:p>
+    <w:p>
+      <w:r>
+        <w:t>doing work I actually get paid for.</w:t>
+      </w:r>
+    </w:p>
+    <w:p>
+      <w:r>
+        <w:t>That is what I showed them.</w:t>
+      </w:r>
+    </w:p>
+    <w:p>
+      <w:r>
+        <w:t>Not a list of prompts. Not a tour of features. I showed them how the system behaves, and how to work</w:t>
+      </w:r>
+    </w:p>
+    <w:p>
+      <w:r>
+        <w:t>with it instead of against it.</w:t>
+      </w:r>
+    </w:p>
+    <w:p>
+      <w:r>
+        <w:t>At the end of the session, one attendee told me that he had never seen anyone use AI the way I did.</w:t>
+      </w:r>
+    </w:p>
+    <w:p>
+      <w:r>
+        <w:t>I kept thinking about that.</w:t>
+      </w:r>
+    </w:p>
+    <w:p>
+      <w:r>
+        <w:t>These were people who knew AI. They were already using it. They had access to one of the most capable</w:t>
+      </w:r>
+    </w:p>
+    <w:p>
+      <w:r>
+        <w:t>tools available, yet they were not getting the results I had shown them. I had a long flight home from</w:t>
+      </w:r>
+    </w:p>
+    <w:p>
+      <w:r>
+        <w:t>India to think about that comment. In the weeks that followed, the premise of this book began to take</w:t>
+      </w:r>
+    </w:p>
+    <w:p>
+      <w:r>
+        <w:t>shape.</w:t>
+      </w:r>
+    </w:p>
+    <w:p>
+      <w:r>
+        <w:t>I was using AI differently, and getting better results.</w:t>
+      </w:r>
+    </w:p>
+    <w:p>
+      <w:r>
+        <w:t>My previous books were instructional. I wrote about how large language models work, how they are</w:t>
+      </w:r>
+    </w:p>
+    <w:p>
+      <w:r>
+        <w:t>built, which models do what, and the tools and prompts people can use to get more from them. Those</w:t>
+      </w:r>
+    </w:p>
+    <w:p>
+      <w:r>
+        <w:t>books were for hands-on users.</w:t>
+      </w:r>
+    </w:p>
+    <w:p>
+      <w:r>
+        <w:t>This book is for a different audience, and it has a different purpose.</w:t>
+      </w:r>
+    </w:p>
+    <w:p>
+      <w:r>
+        <w:t>It is for organisations that are not getting the results they expected from AI—or whose results are</w:t>
+      </w:r>
+    </w:p>
+    <w:p>
+      <w:r>
+        <w:t>costing too much. It is for organisations planning an AI implementation. And it is for the people who</w:t>
+      </w:r>
+    </w:p>
+    <w:p>
+      <w:r>
+        <w:t>sign the cheques and need to keep AI costs under control.</w:t>
+      </w:r>
+    </w:p>
+    <w:p>
+      <w:r>
+        <w:t>The gap is not a shortage of intelligence, effort, or curiosity. It is a shortage of people explaining</w:t>
+      </w:r>
+    </w:p>
+    <w:p>
+      <w:r>
+        <w:t>how these systems actually work.</w:t>
+      </w:r>
+    </w:p>
+    <w:p>
+      <w:r>
+        <w:t xml:space="preserve">The machine itself has every incentive to keep that quiet. A tool that says </w:t>
       </w:r>
       <w:r>
         <w:rPr>
@@ -549,12 +545,12 @@
         <w:t>ask me anything</w:t>
       </w:r>
       <w:r>
-        <w:t xml:space="preserve"> is easier to sell than one that</w:t>
-      </w:r>
-    </w:p>
-    <w:p>
-      <w:r>
-        <w:t xml:space="preserve">says </w:t>
+        <w:t xml:space="preserve"> is</w:t>
+      </w:r>
+    </w:p>
+    <w:p>
+      <w:r>
+        <w:t xml:space="preserve">easier to sell than one that says </w:t>
       </w:r>
       <w:r>
         <w:rPr>
@@ -565,17 +561,17 @@
     </w:p>
     <w:p>
       <w:r>
-        <w:t>So this is what I want to hand you. Not tactics that will be stale by the time you read them, but the shape</w:t>
-      </w:r>
-    </w:p>
-    <w:p>
-      <w:r>
-        <w:t>of the thing: what it is, what it cannot do, and how to build with it anyway.</w:t>
-      </w:r>
-    </w:p>
-    <w:p>
-      <w:r>
-        <w:t>And one thing before we start, because I mean it.</w:t>
+        <w:t>So that is what I want to offer you: not tactics that will be stale by the time you read them, but</w:t>
+      </w:r>
+    </w:p>
+    <w:p>
+      <w:r>
+        <w:t>the shape of the thing. What it is. What it cannot do. And how to build with it anyway.</w:t>
+      </w:r>
+    </w:p>
+    <w:p>
+      <w:r>
+        <w:t>And one thing before we begin, because I mean it.</w:t>
       </w:r>
     </w:p>
     <w:p>
@@ -585,23 +581,20 @@
         </w:rPr>
         <w:t>If you have been using AI wrong, it is not your fault.</w:t>
       </w:r>
-      <w:r>
-        <w:t xml:space="preserve"> Nobody handed you a manual. You were handed a</w:t>
-      </w:r>
-    </w:p>
-    <w:p>
-      <w:r>
-        <w:t>blinking cursor that promised to answer everything, and you did what any reasonable person does with a</w:t>
-      </w:r>
-    </w:p>
-    <w:p>
-      <w:r>
-        <w:t>promise. The rest of this book explains why that cursor could never keep its word — and what to build</w:t>
-      </w:r>
-    </w:p>
-    <w:p>
-      <w:r>
-        <w:t>instead.</w:t>
+    </w:p>
+    <w:p>
+      <w:r>
+        <w:t>Nobody handed you a manual. You were handed a blinking cursor that promised to answer everything, and</w:t>
+      </w:r>
+    </w:p>
+    <w:p>
+      <w:r>
+        <w:t>you did what any reasonable person would do with a promise.</w:t>
+      </w:r>
+    </w:p>
+    <w:p>
+      <w:r>
+        <w:t>The rest of this book explains why that cursor could never keep its word—and what to build instead.</w:t>
       </w:r>
     </w:p>
     <w:p>

</xml_diff>

<commit_message>
Follow-on move (14 Oct 2026): Rules 22-23, Concepts 18-19, Part V and its two closing-chapter skeletons moved to the new repo The-Promise-and-the-Principle with their verified sources. Registers reverted: 27 chapters, close back at Ch 27, 31 rule entries; tombstone pointers in place; derived copies regenerated + re-synced; interior rebuilt (31 rules on the page, scans clean).
</commit_message>
<xml_diff>
--- a/book-build/You-Are-Using-AI-Wrong-INTERIOR.docx
+++ b/book-build/You-Are-Using-AI-Wrong-INTERIOR.docx
@@ -3202,7 +3202,7 @@
         <w:rPr>
           <w:b/>
         </w:rPr>
-        <w:t>2, 13, 14, 16, 17, 22 and 23</w:t>
+        <w:t>2, 13, 14, 16 and 17</w:t>
       </w:r>
       <w:r>
         <w:t xml:space="preserve"> — start there. If you</w:t>
@@ -5314,107 +5314,6 @@
       </w:r>
     </w:p>
     <w:p/>
-    <w:p>
-      <w:r>
-        <w:rPr>
-          <w:b/>
-        </w:rPr>
-        <w:t>22. It does not grant wishes.</w:t>
-      </w:r>
-    </w:p>
-    <w:p>
-      <w:pPr>
-        <w:pStyle w:val="ListBullet"/>
-        <w:ind w:firstLine="0"/>
-      </w:pPr>
-      <w:r>
-        <w:rPr>
-          <w:i/>
-        </w:rPr>
-        <w:t>Assumption:</w:t>
-      </w:r>
-      <w:r>
-        <w:t xml:space="preserve"> the promises are the product — make a million dollars with AI, go viral, replace the workforce.</w:t>
-      </w:r>
-    </w:p>
-    <w:p>
-      <w:pPr>
-        <w:pStyle w:val="ListBullet"/>
-        <w:ind w:firstLine="0"/>
-      </w:pPr>
-      <w:r>
-        <w:rPr>
-          <w:i/>
-        </w:rPr>
-        <w:t>True:</w:t>
-      </w:r>
-      <w:r>
-        <w:t xml:space="preserve"> it is a powerful tool that in the right hands produces efficiency and quality. A wish has no ingredients; work does — and no genie hands you customers that were never won or a workforce that was never hired.</w:t>
-      </w:r>
-    </w:p>
-    <w:p>
-      <w:pPr>
-        <w:pStyle w:val="ListBullet"/>
-        <w:ind w:firstLine="0"/>
-      </w:pPr>
-      <w:r>
-        <w:rPr>
-          <w:b/>
-        </w:rPr>
-        <w:t>Rule: bring the work. AI is not a genie — it does not grant wishes.</w:t>
-      </w:r>
-    </w:p>
-    <w:p/>
-    <w:p>
-      <w:r>
-        <w:rPr>
-          <w:b/>
-        </w:rPr>
-        <w:t>23. Prompts don't replace principles.</w:t>
-      </w:r>
-    </w:p>
-    <w:p>
-      <w:pPr>
-        <w:pStyle w:val="ListBullet"/>
-        <w:ind w:firstLine="0"/>
-      </w:pPr>
-      <w:r>
-        <w:rPr>
-          <w:i/>
-        </w:rPr>
-        <w:t>Assumption:</w:t>
-      </w:r>
-      <w:r>
-        <w:t xml:space="preserve"> a strong prompt can stand in for a philosophy — ask for maximum profit and manage what comes back.</w:t>
-      </w:r>
-    </w:p>
-    <w:p>
-      <w:pPr>
-        <w:pStyle w:val="ListBullet"/>
-        <w:ind w:firstLine="0"/>
-      </w:pPr>
-      <w:r>
-        <w:rPr>
-          <w:i/>
-        </w:rPr>
-        <w:t>True:</w:t>
-      </w:r>
-      <w:r>
-        <w:t xml:space="preserve"> a prompt is a goal, and the easiest path to "maximize profit" is firing people and shrinking portions. Not malice — optimization. Profit without value creation is a short-term gain that arrives as a long-term loss.</w:t>
-      </w:r>
-    </w:p>
-    <w:p>
-      <w:pPr>
-        <w:pStyle w:val="ListBullet"/>
-        <w:ind w:firstLine="0"/>
-      </w:pPr>
-      <w:r>
-        <w:rPr>
-          <w:b/>
-        </w:rPr>
-        <w:t>Rule: define your principles before your prompts — and put them in writing, into the soul.md of every AI.</w:t>
-      </w:r>
-    </w:p>
     <w:p/>
     <w:p>
       <w:pPr>

</xml_diff>

<commit_message>
Ch 23 drafted (14 Oct 2026): Let it build code, because code is checkable — the bytes-look demonstration, the Alpha challenge measurement, compiler-as-judge with its honest limit (does it run vs was it the job); sourced to the project record. Registers updated: all 27 chapters hold prose; interior rebuilt — Chapter 23 prints at p206, 240 pages.
</commit_message>
<xml_diff>
--- a/book-build/You-Are-Using-AI-Wrong-INTERIOR.docx
+++ b/book-build/You-Are-Using-AI-Wrong-INTERIOR.docx
@@ -733,6 +733,24 @@
         <w:tabs>
           <w:tab w:pos="6552" w:val="right" w:leader="dot"/>
         </w:tabs>
+        <w:spacing w:after="120"/>
+        <w:ind w:firstLine="0"/>
+      </w:pPr>
+      <w:r>
+        <w:t>Chapter 23 — Let it build code because code is checkable</w:t>
+      </w:r>
+      <w:r>
+        <w:tab/>
+      </w:r>
+      <w:r>
+        <w:t>206</w:t>
+      </w:r>
+    </w:p>
+    <w:p>
+      <w:pPr>
+        <w:tabs>
+          <w:tab w:pos="6552" w:val="right" w:leader="dot"/>
+        </w:tabs>
         <w:spacing w:after="120" w:before="200"/>
         <w:ind w:firstLine="0"/>
       </w:pPr>
@@ -746,7 +764,7 @@
         <w:tab/>
       </w:r>
       <w:r>
-        <w:t>206</w:t>
+        <w:t>212</w:t>
       </w:r>
     </w:p>
     <w:p>
@@ -764,7 +782,7 @@
         <w:tab/>
       </w:r>
       <w:r>
-        <w:t>207</w:t>
+        <w:t>213</w:t>
       </w:r>
     </w:p>
     <w:p>
@@ -782,7 +800,7 @@
         <w:tab/>
       </w:r>
       <w:r>
-        <w:t>215</w:t>
+        <w:t>221</w:t>
       </w:r>
     </w:p>
     <w:p>
@@ -800,7 +818,7 @@
         <w:tab/>
       </w:r>
       <w:r>
-        <w:t>221</w:t>
+        <w:t>227</w:t>
       </w:r>
     </w:p>
     <w:p>
@@ -818,7 +836,7 @@
         <w:tab/>
       </w:r>
       <w:r>
-        <w:t>226</w:t>
+        <w:t>232</w:t>
       </w:r>
     </w:p>
     <w:p>
@@ -26415,6 +26433,720 @@
           <w:sz w:val="19"/>
         </w:rPr>
         <w:t>; line 96: the model table marks it "Recommended"). Recommending a model in a setup doc is not the same as verifying it runs CPU-only today; the chapter carries the author's own  to that effect.</w:t>
+      </w:r>
+    </w:p>
+    <w:p>
+      <w:r>
+        <w:br w:type="page"/>
+      </w:r>
+    </w:p>
+    <w:p>
+      <w:pPr>
+        <w:pStyle w:val="Heading1"/>
+      </w:pPr>
+      <w:r>
+        <w:t>Chapter 23 — Let it build code because code is checkable</w:t>
+      </w:r>
+    </w:p>
+    <w:p>
+      <w:pPr>
+        <w:ind w:firstLine="0"/>
+      </w:pPr>
+      <w:r>
+        <w:t>Working software tells you the truth about itself, which is more than most answers manage.</w:t>
+      </w:r>
+    </w:p>
+    <w:p/>
+    <w:p>
+      <w:r>
+        <w:t>Everything else a model produces asserts. A fluent paragraph claims a fact; a persuasive summary</w:t>
+      </w:r>
+    </w:p>
+    <w:p>
+      <w:r>
+        <w:t>claims to have weighed the evidence; an analysis claims a conclusion follows. Nothing in any of it</w:t>
+      </w:r>
+    </w:p>
+    <w:p>
+      <w:r>
+        <w:t>signals whether any of that holds. A program is different: it either runs or it throws. The deliverable</w:t>
+      </w:r>
+    </w:p>
+    <w:p>
+      <w:r>
+        <w:t>carries its own test, and the test is cheap. That asymmetry is the whole subject of this chapter, and</w:t>
+      </w:r>
+    </w:p>
+    <w:p>
+      <w:r>
+        <w:t>it changes where AI belongs in your work.</w:t>
+      </w:r>
+    </w:p>
+    <w:p/>
+    <w:p>
+      <w:pPr>
+        <w:pStyle w:val="Heading3"/>
+      </w:pPr>
+      <w:r>
+        <w:t>The payload that lied about its own shape</w:t>
+      </w:r>
+    </w:p>
+    <w:p>
+      <w:pPr>
+        <w:ind w:firstLine="0"/>
+      </w:pPr>
+    </w:p>
+    <w:p>
+      <w:r>
+        <w:t>The demonstration comes from my own project, and it is a single recorded run — it demonstrates the</w:t>
+      </w:r>
+    </w:p>
+    <w:p>
+      <w:r>
+        <w:t>mechanism, not a rate.</w:t>
+      </w:r>
+      <w:r>
+        <w:rPr>
+          <w:vertAlign w:val="superscript"/>
+        </w:rPr>
+        <w:t>1</w:t>
+      </w:r>
+    </w:p>
+    <w:p/>
+    <w:p>
+      <w:r>
+        <w:t>The system had asked for an audio file. What came back carried an audio file's name and an audio</w:t>
+      </w:r>
+    </w:p>
+    <w:p>
+      <w:r>
+        <w:t>file's extension, as far as the filename went. Nothing about the response's wording would have raised</w:t>
+      </w:r>
+    </w:p>
+    <w:p>
+      <w:r>
+        <w:t>an eyebrow — the model that produced it would have cheerfully explained what it had made. The file</w:t>
+      </w:r>
+    </w:p>
+    <w:p>
+      <w:r>
+        <w:t xml:space="preserve">was a lie told in eight characters, and the way it was caught was by </w:t>
+      </w:r>
+      <w:r>
+        <w:rPr>
+          <w:b/>
+        </w:rPr>
+        <w:t>looking at the bytes</w:t>
+      </w:r>
+      <w:r>
+        <w:t>: the</w:t>
+      </w:r>
+    </w:p>
+    <w:p>
+      <w:r>
+        <w:t xml:space="preserve">first two were </w:t>
+      </w:r>
+      <w:r>
+        <w:rPr>
+          <w:rFonts w:ascii="Consolas" w:hAnsi="Consolas"/>
+          <w:sz w:val="19"/>
+        </w:rPr>
+        <w:t>{"</w:t>
+      </w:r>
+      <w:r>
+        <w:t>. A JSON document was wearing an audio file's name.</w:t>
+      </w:r>
+    </w:p>
+    <w:p/>
+    <w:p>
+      <w:r>
+        <w:t>Notice what did not find the failure. Nobody asked the producing model whether it had done the job</w:t>
+      </w:r>
+    </w:p>
+    <w:p>
+      <w:r>
+        <w:t>right — the producer's opinion is exactly the thing this book teaches you not to buy. Nobody read a</w:t>
+      </w:r>
+    </w:p>
+    <w:p>
+      <w:r>
+        <w:t>fluent description of the output. The check that worked was the dumbest one available: open the</w:t>
+      </w:r>
+    </w:p>
+    <w:p>
+      <w:r>
+        <w:t>artifact and look at what is actually there.</w:t>
+      </w:r>
+    </w:p>
+    <w:p/>
+    <w:p>
+      <w:r>
+        <w:t>That is the discipline the rest of this chapter argues for, and it is worth stating plainly: **the</w:t>
+      </w:r>
+    </w:p>
+    <w:p>
+      <w:r>
+        <w:t>artifact is the second opinion that cannot flatter you.** A model asked to review its own work will</w:t>
+      </w:r>
+    </w:p>
+    <w:p>
+      <w:r>
+        <w:t>produce confident agreement (Chapter 2). The bytes, the spreadsheet, the rendered page, the executed</w:t>
+      </w:r>
+    </w:p>
+    <w:p>
+      <w:r>
+        <w:t>test — these agree with you or they do not, and they have no training incentive to smooth it over.</w:t>
+      </w:r>
+    </w:p>
+    <w:p/>
+    <w:p>
+      <w:pPr>
+        <w:pStyle w:val="Heading3"/>
+      </w:pPr>
+      <w:r>
+        <w:t>Code is the deliverable with a compiler</w:t>
+      </w:r>
+    </w:p>
+    <w:p>
+      <w:pPr>
+        <w:ind w:firstLine="0"/>
+      </w:pPr>
+    </w:p>
+    <w:p>
+      <w:r>
+        <w:t>Chapter 16 told the story of the two waves. The first wave was the IT group, whose trust in AI was</w:t>
+      </w:r>
+    </w:p>
+    <w:p>
+      <w:r>
+        <w:t>earned: they wrote code, and code has a compiler — the group had a verification loop that could not</w:t>
+      </w:r>
+    </w:p>
+    <w:p>
+      <w:r>
+        <w:t>be fooled. The second wave inherited the tool for work with no compiler — reports, summaries,</w:t>
+      </w:r>
+    </w:p>
+    <w:p>
+      <w:r>
+        <w:t>analysis — and inherited the trust without the check. The book's whole cost argument lives in that</w:t>
+      </w:r>
+    </w:p>
+    <w:p>
+      <w:r>
+        <w:t>gap, and this chapter supplies the honest version of the fix.</w:t>
+      </w:r>
+    </w:p>
+    <w:p/>
+    <w:p>
+      <w:r>
+        <w:t>The fix is not "stop using AI for prose," and it is not "code is the only safe output." The fix is to</w:t>
+      </w:r>
+    </w:p>
+    <w:p>
+      <w:r>
+        <w:t>know which kind of work you are handing over. **Where the deliverable can be executed, let the model</w:t>
+      </w:r>
+    </w:p>
+    <w:p>
+      <w:r>
+        <w:t>build it — and keep the execution in your hands.** Where it cannot be executed, everything this book</w:t>
+      </w:r>
+    </w:p>
+    <w:p>
+      <w:r>
+        <w:t>says about confinement, sources and judgement applies in full (Parts II and III). The mistake is not</w:t>
+      </w:r>
+    </w:p>
+    <w:p>
+      <w:r>
+        <w:t>the task; it is sending uncheckable work out with checkable-work confidence.</w:t>
+      </w:r>
+    </w:p>
+    <w:p/>
+    <w:p>
+      <w:r>
+        <w:t>And the model's part is real. It can write the script, draft the query, generate the transformation,</w:t>
+      </w:r>
+    </w:p>
+    <w:p>
+      <w:r>
+        <w:t>assemble the report pipeline. The book never said otherwise — Chapter 15 and Chapter 17 are built on</w:t>
+      </w:r>
+    </w:p>
+    <w:p>
+      <w:r>
+        <w:t>models doing model-sized work. What the model cannot supply is the standard the work must meet, and</w:t>
+      </w:r>
+    </w:p>
+    <w:p>
+      <w:r>
+        <w:t xml:space="preserve">code is the one deliverable where the standard can be </w:t>
+      </w:r>
+      <w:r>
+        <w:rPr>
+          <w:i/>
+        </w:rPr>
+        <w:t>run</w:t>
+      </w:r>
+      <w:r>
+        <w:t xml:space="preserve"> rather than </w:t>
+      </w:r>
+      <w:r>
+        <w:rPr>
+          <w:i/>
+        </w:rPr>
+        <w:t>described</w:t>
+      </w:r>
+      <w:r>
+        <w:t>.</w:t>
+      </w:r>
+    </w:p>
+    <w:p/>
+    <w:p>
+      <w:pPr>
+        <w:pStyle w:val="Heading3"/>
+      </w:pPr>
+      <w:r>
+        <w:t>The Alpha challenge: measurement, not persuasion</w:t>
+      </w:r>
+    </w:p>
+    <w:p>
+      <w:pPr>
+        <w:ind w:firstLine="0"/>
+      </w:pPr>
+    </w:p>
+    <w:p>
+      <w:r>
+        <w:t>The second demonstration is already in this book's record. Chapter 16's provider registry was not</w:t>
+      </w:r>
+    </w:p>
+    <w:p>
+      <w:r>
+        <w:t>built on trust, and it was not built on a model's ranking of itself — the author ran the Alpha</w:t>
+      </w:r>
+    </w:p>
+    <w:p>
+      <w:r>
+        <w:t>challenge: five fixed, code-scored tests, including a grounding test, with incumbent candidates</w:t>
+      </w:r>
+    </w:p>
+    <w:p>
+      <w:r>
+        <w:t>defending their position.</w:t>
+      </w:r>
+      <w:r>
+        <w:rPr>
+          <w:vertAlign w:val="superscript"/>
+        </w:rPr>
+        <w:t>2</w:t>
+      </w:r>
+    </w:p>
+    <w:p/>
+    <w:p>
+      <w:r>
+        <w:t>Three models scored perfectly. One was caught inventing — the grounding test asked for the capital</w:t>
+      </w:r>
+    </w:p>
+    <w:p>
+      <w:r>
+        <w:t>of a country that does not exist, and the fabrication was visible in the record. The incumbent</w:t>
+      </w:r>
+    </w:p>
+    <w:p>
+      <w:r>
+        <w:t>defended at one hundred percent. Ties held. Nobody was persuaded of anything; the measurement said</w:t>
+      </w:r>
+    </w:p>
+    <w:p>
+      <w:r>
+        <w:t>what it said, in code, and the promotion decision followed the scores.</w:t>
+      </w:r>
+    </w:p>
+    <w:p/>
+    <w:p>
+      <w:r>
+        <w:t>That is the shape of every check worth having: a test written before the answer arrives, scored by</w:t>
+      </w:r>
+    </w:p>
+    <w:p>
+      <w:r>
+        <w:t>something that is not part of the conversation. A model judging another model's output is the trap</w:t>
+      </w:r>
+    </w:p>
+    <w:p>
+      <w:r>
+        <w:t>(Chapter 18's agents; Chapter 21's "you cannot ask a model who's best"). The compiler, the test</w:t>
+      </w:r>
+    </w:p>
+    <w:p>
+      <w:r>
+        <w:t>suite, the byte inspection — these are checkable judges, and the book's whole architecture leans on</w:t>
+      </w:r>
+    </w:p>
+    <w:p>
+      <w:r>
+        <w:t>them: contracts at the boundary (Chapter 14), measurement before promotion (Chapter 24's first</w:t>
+      </w:r>
+    </w:p>
+    <w:p>
+      <w:r>
+        <w:t>pillar), the recorded result instead of the explained result.</w:t>
+      </w:r>
+    </w:p>
+    <w:p/>
+    <w:p>
+      <w:pPr>
+        <w:pStyle w:val="Heading3"/>
+      </w:pPr>
+      <w:r>
+        <w:t>What code does not excuse</w:t>
+      </w:r>
+    </w:p>
+    <w:p>
+      <w:pPr>
+        <w:ind w:firstLine="0"/>
+      </w:pPr>
+    </w:p>
+    <w:p>
+      <w:r>
+        <w:t xml:space="preserve">One honest limit, or the rule overclaims. Code that runs is not code that is </w:t>
+      </w:r>
+      <w:r>
+        <w:rPr>
+          <w:i/>
+        </w:rPr>
+        <w:t>right for the purpose</w:t>
+      </w:r>
+      <w:r>
+        <w:t>.</w:t>
+      </w:r>
+    </w:p>
+    <w:p>
+      <w:r>
+        <w:t>A script can execute cleanly and compute the wrong thing, because the specification was thin — and a</w:t>
+      </w:r>
+    </w:p>
+    <w:p>
+      <w:r>
+        <w:t>model will happily pass a shallow test. The test you write is the judge, which means the judge is</w:t>
+      </w:r>
+    </w:p>
+    <w:p>
+      <w:r>
+        <w:t>still yours: the requirements come from you (Chapter 14's contract), the brief from someone who has</w:t>
+      </w:r>
+    </w:p>
+    <w:p>
+      <w:r>
+        <w:t xml:space="preserve">done the work (Chapter 19). Code is checkable; </w:t>
+      </w:r>
+      <w:r>
+        <w:rPr>
+          <w:i/>
+        </w:rPr>
+        <w:t>correctness to purpose</w:t>
+      </w:r>
+      <w:r>
+        <w:t xml:space="preserve"> still lives with the human.</w:t>
+      </w:r>
+    </w:p>
+    <w:p>
+      <w:r>
+        <w:t>That is not a caveat against the rule. It is the rule being precise: the compiler settles **does it</w:t>
+      </w:r>
+    </w:p>
+    <w:p>
+      <w:r>
+        <w:t>run</w:t>
+      </w:r>
+      <w:r>
+        <w:rPr>
+          <w:b/>
+        </w:rPr>
+        <w:t xml:space="preserve"> — you settle </w:t>
+      </w:r>
+      <w:r>
+        <w:t>was it the job.**</w:t>
+      </w:r>
+    </w:p>
+    <w:p/>
+    <w:p>
+      <w:r>
+        <w:t>And a single recorded run stays a single recorded run. The chapter's claim is the asymmetry —</w:t>
+      </w:r>
+    </w:p>
+    <w:p>
+      <w:r>
+        <w:t>checkable output beats asserted output — which needs no statistics to hold. Where you want a rate,</w:t>
+      </w:r>
+    </w:p>
+    <w:p>
+      <w:r>
+        <w:t>run the Alpha challenge again on your own tasks; the book's method is designed to be re-run, not</w:t>
+      </w:r>
+    </w:p>
+    <w:p>
+      <w:r>
+        <w:t>believed.</w:t>
+      </w:r>
+    </w:p>
+    <w:p/>
+    <w:p>
+      <w:pPr>
+        <w:pStyle w:val="Heading3"/>
+      </w:pPr>
+      <w:r>
+        <w:t>What changes</w:t>
+      </w:r>
+    </w:p>
+    <w:p>
+      <w:pPr>
+        <w:ind w:firstLine="0"/>
+      </w:pPr>
+    </w:p>
+    <w:p>
+      <w:r>
+        <w:t xml:space="preserve">It changes what you ask for. Where a working artefact is possible, ask for one: </w:t>
+      </w:r>
+      <w:r>
+        <w:rPr>
+          <w:rFonts w:ascii="Consolas" w:hAnsi="Consolas"/>
+          <w:sz w:val="19"/>
+        </w:rPr>
+        <w:t>write the query</w:t>
+      </w:r>
+      <w:r>
+        <w:t>,</w:t>
+      </w:r>
+    </w:p>
+    <w:p>
+      <w:r>
+        <w:t xml:space="preserve">not </w:t>
+      </w:r>
+      <w:r>
+        <w:rPr>
+          <w:rFonts w:ascii="Consolas" w:hAnsi="Consolas"/>
+          <w:sz w:val="19"/>
+        </w:rPr>
+        <w:t>explain how you would build the query</w:t>
+      </w:r>
+      <w:r>
+        <w:t xml:space="preserve">; </w:t>
+      </w:r>
+      <w:r>
+        <w:rPr>
+          <w:rFonts w:ascii="Consolas" w:hAnsi="Consolas"/>
+          <w:sz w:val="19"/>
+        </w:rPr>
+        <w:t>make the failing test pass</w:t>
+      </w:r>
+      <w:r>
+        <w:t>, not `tell me why the</w:t>
+      </w:r>
+    </w:p>
+    <w:p>
+      <w:r>
+        <w:t>test might fail`. Working artefacts can be inspected, run and re-run — and they turn every following</w:t>
+      </w:r>
+    </w:p>
+    <w:p>
+      <w:r>
+        <w:t>conversation into a check of something that exists.</w:t>
+      </w:r>
+    </w:p>
+    <w:p/>
+    <w:p>
+      <w:r>
+        <w:t>It changes where you put the checks. Keep the tests where you can read them. Keep the acceptance</w:t>
+      </w:r>
+    </w:p>
+    <w:p>
+      <w:r>
+        <w:t>criteria in the contract, not in the model's memory (Chapter 6 — the conversation holds none of it).</w:t>
+      </w:r>
+    </w:p>
+    <w:p>
+      <w:r>
+        <w:t>When a produced artefact fails, the failure is information — Chapter 14's rule: do not quietly fix a</w:t>
+      </w:r>
+    </w:p>
+    <w:p>
+      <w:r>
+        <w:t>failed answer; record it.</w:t>
+      </w:r>
+    </w:p>
+    <w:p/>
+    <w:p>
+      <w:r>
+        <w:t>And it changes the default posture toward AI work in your organization: the second wave was not</w:t>
+      </w:r>
+    </w:p>
+    <w:p>
+      <w:r>
+        <w:t xml:space="preserve">wrong to adopt the tool, it was wrong to adopt the tool's </w:t>
+      </w:r>
+      <w:r>
+        <w:rPr>
+          <w:i/>
+        </w:rPr>
+        <w:t>confidence</w:t>
+      </w:r>
+      <w:r>
+        <w:t xml:space="preserve"> for work with no check. Give</w:t>
+      </w:r>
+    </w:p>
+    <w:p>
+      <w:r>
+        <w:t>every AI task findable judge — a test, a run, an inspection — before you give it a budget. For</w:t>
+      </w:r>
+    </w:p>
+    <w:p>
+      <w:r>
+        <w:t>everything a model produces, the cheapest honest question is the same one: **what tells me this</w:t>
+      </w:r>
+    </w:p>
+    <w:p>
+      <w:r>
+        <w:t>worked?** For code, the answer exists. Ask for the deliverable that comes with it.</w:t>
+      </w:r>
+    </w:p>
+    <w:p/>
+    <w:p>
+      <w:pPr>
+        <w:pStyle w:val="Heading3"/>
+      </w:pPr>
+      <w:r>
+        <w:t>Remember This</w:t>
+      </w:r>
+    </w:p>
+    <w:p>
+      <w:pPr>
+        <w:ind w:firstLine="0"/>
+      </w:pPr>
+    </w:p>
+    <w:p>
+      <w:pPr>
+        <w:pStyle w:val="ListBullet"/>
+        <w:ind w:firstLine="0"/>
+      </w:pPr>
+      <w:r>
+        <w:t>Code either runs or it throws — the only deliverable in this book that grades itself.</w:t>
+      </w:r>
+    </w:p>
+    <w:p>
+      <w:pPr>
+        <w:pStyle w:val="ListBullet"/>
+        <w:ind w:firstLine="0"/>
+      </w:pPr>
+      <w:r>
+        <w:t>Inspect the artifact, never accept the producer's account of the artifact. The bytes caught what</w:t>
+      </w:r>
+    </w:p>
+    <w:p>
+      <w:r>
+        <w:t xml:space="preserve">  the flattery would have approved.</w:t>
+      </w:r>
+    </w:p>
+    <w:p>
+      <w:pPr>
+        <w:pStyle w:val="ListBullet"/>
+        <w:ind w:firstLine="0"/>
+      </w:pPr>
+      <w:r>
+        <w:t>Write the test before the answer arrives; a model can pass a shallow test, so the specification</w:t>
+      </w:r>
+    </w:p>
+    <w:p>
+      <w:r>
+        <w:t xml:space="preserve">  stays yours.</w:t>
+      </w:r>
+    </w:p>
+    <w:p>
+      <w:pPr>
+        <w:pStyle w:val="ListBullet"/>
+        <w:ind w:firstLine="0"/>
+      </w:pPr>
+      <w:r>
+        <w:t>Uncheckable work is not forbidden — it is governed by the rest of this book. Checkable work is</w:t>
+      </w:r>
+    </w:p>
+    <w:p>
+      <w:r>
+        <w:t xml:space="preserve">  governed by running it.</w:t>
+      </w:r>
+    </w:p>
+    <w:p/>
+    <w:p>
+      <w:pPr>
+        <w:pStyle w:val="Heading2"/>
+      </w:pPr>
+      <w:r>
+        <w:t>Source notes</w:t>
+      </w:r>
+    </w:p>
+    <w:p>
+      <w:pPr>
+        <w:spacing w:after="120"/>
+        <w:ind w:firstLine="0" w:left="432"/>
+      </w:pPr>
+      <w:r>
+        <w:rPr>
+          <w:sz w:val="19"/>
+        </w:rPr>
+        <w:t xml:space="preserve">1. The recorded bug: an output named and sized as an audio file whose first bytes were the JSON opener </w:t>
+      </w:r>
+      <w:r>
+        <w:rPr>
+          <w:rFonts w:ascii="Consolas" w:hAnsi="Consolas"/>
+          <w:sz w:val="19"/>
+        </w:rPr>
+        <w:t>{"</w:t>
+      </w:r>
+      <w:r>
+        <w:rPr>
+          <w:sz w:val="19"/>
+        </w:rPr>
+        <w:t xml:space="preserve"> — caught on inspection, not on review. Project record; the run is the author's own (witness, per Rule 15b — presented as such, no rate claimed).</w:t>
+      </w:r>
+    </w:p>
+    <w:p>
+      <w:pPr>
+        <w:spacing w:after="120"/>
+        <w:ind w:firstLine="0" w:left="432"/>
+      </w:pPr>
+      <w:r>
+        <w:rPr>
+          <w:sz w:val="19"/>
+        </w:rPr>
+        <w:t>2. The Alpha challenge: five code-scored tests with a grounding case — recorded in the project (</w:t>
+      </w:r>
+      <w:r>
+        <w:rPr>
+          <w:rFonts w:ascii="Consolas" w:hAnsi="Consolas"/>
+          <w:sz w:val="19"/>
+        </w:rPr>
+        <w:t>alpha.ts</w:t>
+      </w:r>
+      <w:r>
+        <w:rPr>
+          <w:sz w:val="19"/>
+        </w:rPr>
+        <w:t xml:space="preserve">, five BenchCase entries; </w:t>
+      </w:r>
+      <w:r>
+        <w:rPr>
+          <w:rFonts w:ascii="Consolas" w:hAnsi="Consolas"/>
+          <w:sz w:val="19"/>
+        </w:rPr>
+        <w:t>docs/SELF-EDUCATION.md</w:t>
+      </w:r>
+      <w:r>
+        <w:rPr>
+          <w:sz w:val="19"/>
+        </w:rPr>
+        <w:t>: "the grounding test caught one model fabricating; the incumbent defended at 100%"). The counts are the project's own record, offered as a demonstration of the method, not a benchmark.</w:t>
       </w:r>
     </w:p>
     <w:p>

</xml_diff>